<commit_message>
Refine figures: fix panel labels, legend overlaps, and annotations
- Fig 2: consistent a/b panel-label placement; shorten legend labels and add
  headroom so the legend no longer overlaps the histogram bars
- Fig 3b: connect the bunching annotation to the reference-point spike with a
  curved arrow so it no longer floats
- Fig 4a: remove the ambiguous arrow glyph; reword the markup->sale-probability note
- Fig 5a: raise y-limit and move the legend above the bars to avoid overlap

Co-Authored-By: Claude Opus 4.8 <noreply@anthropic.com>
Claude-Session: https://claude.ai/code/session_01M398msZF94FDAneb8hDzHP
</commit_message>
<xml_diff>
--- a/work/nature-comms-housing/manuscript/Seller_loss_aversion_and_housing_market_liquidity_NatureComms.docx
+++ b/work/nature-comms-housing/manuscript/Seller_loss_aversion_and_housing_market_liquidity_NatureComms.docx
@@ -661,7 +661,7 @@
       <w:r>
         <w:drawing>
           <wp:inline>
-            <wp:extent cx="5334000" cy="3057258"/>
+            <wp:extent cx="5334000" cy="3100495"/>
             <wp:effectExtent b="0" l="0" r="0" t="0"/>
             <wp:docPr descr="" title="" id="26" name="Picture"/>
             <a:graphic>
@@ -682,7 +682,7 @@
                   <pic:spPr bwMode="auto">
                     <a:xfrm>
                       <a:off x="0" y="0"/>
-                      <a:ext cx="5334000" cy="3057258"/>
+                      <a:ext cx="5334000" cy="3100495"/>
                     </a:xfrm>
                     <a:prstGeom prst="rect">
                       <a:avLst/>

</xml_diff>